<commit_message>
Align Week 1 and Week 2 report dates with internship timeline
</commit_message>
<xml_diff>
--- a/Week_1_QA_Test_Plan_Online_Student_Management_Portal.docx
+++ b/Week_1_QA_Test_Plan_Online_Student_Management_Portal.docx
@@ -208,14 +208,8 @@
             <w:shd w:fill="F2F6FA"/>
           </w:tcPr>
           <w:p>
-            <w:pPr>
-              <w:spacing w:after="40"/>
-            </w:pPr>
-            <w:r>
-              <w:rPr>
-                <w:sz w:val="16"/>
-              </w:rPr>
-              <w:t>Date</w:t>
+            <w:r>
+              <w:t>Report date</w:t>
             </w:r>
           </w:p>
         </w:tc>
@@ -225,14 +219,8 @@
             <w:shd w:fill="F2F6FA"/>
           </w:tcPr>
           <w:p>
-            <w:pPr>
-              <w:spacing w:after="40"/>
-            </w:pPr>
-            <w:r>
-              <w:rPr>
-                <w:sz w:val="16"/>
-              </w:rPr>
-              <w:t>6 October 2026</w:t>
+            <w:r>
+              <w:t>23 August 2026</w:t>
             </w:r>
           </w:p>
         </w:tc>
@@ -303,6 +291,43 @@
                 <w:sz w:val="16"/>
               </w:rPr>
               <w:t>At scope, requirement, or release changes</w:t>
+            </w:r>
+          </w:p>
+        </w:tc>
+      </w:tr>
+      <w:tr>
+        <w:tc>
+          <w:tcPr>
+            <w:tcW w:type="dxa" w:w="2880"/>
+            <w:shd w:fill="F2F6FA"/>
+          </w:tcPr>
+          <w:p>
+            <w:pPr>
+              <w:spacing w:after="40"/>
+            </w:pPr>
+            <w:r>
+              <w:rPr>
+                <w:color w:val="26303C"/>
+                <w:sz w:val="17"/>
+              </w:rPr>
+              <w:t>Internship period</w:t>
+            </w:r>
+          </w:p>
+        </w:tc>
+        <w:tc>
+          <w:tcPr>
+            <w:tcW w:type="dxa" w:w="6624"/>
+          </w:tcPr>
+          <w:p>
+            <w:pPr>
+              <w:spacing w:after="40"/>
+            </w:pPr>
+            <w:r>
+              <w:rPr>
+                <w:color w:val="26303C"/>
+                <w:sz w:val="17"/>
+              </w:rPr>
+              <w:t>21 August 2026 to 2 October 2026</w:t>
             </w:r>
           </w:p>
         </w:tc>
@@ -318,9 +343,7 @@
       </w:r>
     </w:p>
     <w:p>
-      <w:r>
-        <w:br w:type="page"/>
-      </w:r>
+      <w:r/>
     </w:p>
     <w:p>
       <w:pPr>
@@ -463,7 +486,7 @@
               <w:rPr>
                 <w:sz w:val="16"/>
               </w:rPr>
-              <w:t>6 Oct 2026</w:t>
+              <w:t>23 Aug 2026</w:t>
             </w:r>
           </w:p>
         </w:tc>

</xml_diff>

<commit_message>
Match report date rows to table formatting
</commit_message>
<xml_diff>
--- a/Week_1_QA_Test_Plan_Online_Student_Management_Portal.docx
+++ b/Week_1_QA_Test_Plan_Online_Student_Management_Portal.docx
@@ -209,6 +209,9 @@
           </w:tcPr>
           <w:p>
             <w:r>
+              <w:rPr>
+                <w:sz w:val="16"/>
+              </w:rPr>
               <w:t>Report date</w:t>
             </w:r>
           </w:p>
@@ -220,6 +223,9 @@
           </w:tcPr>
           <w:p>
             <w:r>
+              <w:rPr>
+                <w:sz w:val="16"/>
+              </w:rPr>
               <w:t>23 August 2026</w:t>
             </w:r>
           </w:p>
@@ -307,8 +313,7 @@
             </w:pPr>
             <w:r>
               <w:rPr>
-                <w:color w:val="26303C"/>
-                <w:sz w:val="17"/>
+                <w:sz w:val="16"/>
               </w:rPr>
               <w:t>Internship period</w:t>
             </w:r>
@@ -324,8 +329,7 @@
             </w:pPr>
             <w:r>
               <w:rPr>
-                <w:color w:val="26303C"/>
-                <w:sz w:val="17"/>
+                <w:sz w:val="16"/>
               </w:rPr>
               <w:t>21 August 2026 to 2 October 2026</w:t>
             </w:r>

</xml_diff>